<commit_message>
Rename results folder to Results to match project layout requirements
</commit_message>
<xml_diff>
--- a/Project_Report.docx
+++ b/Project_Report.docx
@@ -917,7 +917,7 @@
           </w:tcPr>
           <w:p>
             <w:r>
-              <w:t>![Speech Temporal Clusters](results/plots/temporal_clusters.png)</w:t>
+              <w:t>![Speech Temporal Clusters](Results/plots/temporal_clusters.png)</w:t>
             </w:r>
           </w:p>
         </w:tc>
@@ -927,7 +927,7 @@
           </w:tcPr>
           <w:p>
             <w:r>
-              <w:t>![Text Contextual Clusters](results/plots/contextual_clusters.png)</w:t>
+              <w:t>![Text Contextual Clusters](Results/plots/contextual_clusters.png)</w:t>
             </w:r>
           </w:p>
         </w:tc>
@@ -937,7 +937,7 @@
           </w:tcPr>
           <w:p>
             <w:r>
-              <w:t>![Fusion Clusters](results/plots/fusion_clusters.png)</w:t>
+              <w:t>![Fusion Clusters](Results/plots/fusion_clusters.png)</w:t>
             </w:r>
           </w:p>
         </w:tc>

</xml_diff>